<commit_message>
Add DWDA compliance, unified render_service, and docs/rules sync.
Unify Streamlit, CLI, and project-folder rendering through render_service with appendix-aware SED/DWDA enrichment, compliance manifest snapshots, and qp_checklists in deliverable zip. Add Ecoventure workbook ingest, 284-test suite with count guard, Windows CI smoke job, and scoped DWDA Cursor rule.
</commit_message>
<xml_diff>
--- a/samples/appendices/appendix_d_drilling_waste_checklist.docx
+++ b/samples/appendices/appendix_d_drilling_waste_checklist.docx
@@ -87,6 +87,168 @@
         <w:t>{{ drilling_waste_summary }}</w:t>
       </w:r>
     </w:p>
+    <w:p/>
+    <w:p>
+      <w:r>
+        <w:t>Guideline scope: {{ dwda_guideline_summary }}</w:t>
+      </w:r>
+    </w:p>
+    <w:p>
+      <w:r>
+        <w:t>Compliance summary: {{ dwda_compliance_summary }}</w:t>
+      </w:r>
+    </w:p>
+    <w:p/>
+    <w:p/>
+    <w:p>
+      <w:r>
+        <w:t>DWDA compliance checklist (companion to official AER form):</w:t>
+      </w:r>
+    </w:p>
+    <w:tbl>
+      <w:tblPr>
+        <w:tblStyle w:val="TableGrid"/>
+        <w:tblW w:type="auto" w:w="0"/>
+        <w:tblLook w:firstColumn="1" w:firstRow="1" w:lastColumn="0" w:lastRow="0" w:noHBand="0" w:noVBand="1" w:val="04A0"/>
+      </w:tblPr>
+      <w:tblGrid>
+        <w:gridCol w:w="1728"/>
+        <w:gridCol w:w="1728"/>
+        <w:gridCol w:w="1728"/>
+        <w:gridCol w:w="1728"/>
+        <w:gridCol w:w="1728"/>
+      </w:tblGrid>
+      <w:tr>
+        <w:tc>
+          <w:tcPr>
+            <w:tcW w:type="dxa" w:w="1728"/>
+          </w:tcPr>
+          <w:p>
+            <w:r>
+              <w:t>Section</w:t>
+            </w:r>
+          </w:p>
+        </w:tc>
+        <w:tc>
+          <w:tcPr>
+            <w:tcW w:type="dxa" w:w="1728"/>
+          </w:tcPr>
+          <w:p>
+            <w:r>
+              <w:t>Item</w:t>
+            </w:r>
+          </w:p>
+        </w:tc>
+        <w:tc>
+          <w:tcPr>
+            <w:tcW w:type="dxa" w:w="1728"/>
+          </w:tcPr>
+          <w:p>
+            <w:r>
+              <w:t>Status</w:t>
+            </w:r>
+          </w:p>
+        </w:tc>
+        <w:tc>
+          <w:tcPr>
+            <w:tcW w:type="dxa" w:w="1728"/>
+          </w:tcPr>
+          <w:p>
+            <w:r>
+              <w:t>Response</w:t>
+            </w:r>
+          </w:p>
+        </w:tc>
+        <w:tc>
+          <w:tcPr>
+            <w:tcW w:type="dxa" w:w="1728"/>
+          </w:tcPr>
+          <w:p>
+            <w:r>
+              <w:t>Detail</w:t>
+            </w:r>
+          </w:p>
+        </w:tc>
+      </w:tr>
+      <w:tr>
+        <w:tc>
+          <w:tcPr>
+            <w:tcW w:type="dxa" w:w="8640"/>
+            <w:gridSpan w:val="5"/>
+          </w:tcPr>
+          <w:p>
+            <w:r>
+              <w:t>{%tr for item in dwda_checklist_results %}</w:t>
+            </w:r>
+          </w:p>
+        </w:tc>
+      </w:tr>
+      <w:tr>
+        <w:tc>
+          <w:tcPr>
+            <w:tcW w:type="dxa" w:w="1728"/>
+          </w:tcPr>
+          <w:p>
+            <w:r>
+              <w:t>{{ item.section }}</w:t>
+            </w:r>
+          </w:p>
+        </w:tc>
+        <w:tc>
+          <w:tcPr>
+            <w:tcW w:type="dxa" w:w="1728"/>
+          </w:tcPr>
+          <w:p>
+            <w:r>
+              <w:t>{{ item.label }}</w:t>
+            </w:r>
+          </w:p>
+        </w:tc>
+        <w:tc>
+          <w:tcPr>
+            <w:tcW w:type="dxa" w:w="1728"/>
+          </w:tcPr>
+          <w:p>
+            <w:r>
+              <w:t>{{ item.status }}</w:t>
+            </w:r>
+          </w:p>
+        </w:tc>
+        <w:tc>
+          <w:tcPr>
+            <w:tcW w:type="dxa" w:w="1728"/>
+          </w:tcPr>
+          <w:p>
+            <w:r>
+              <w:t>{{ item.response }}</w:t>
+            </w:r>
+          </w:p>
+        </w:tc>
+        <w:tc>
+          <w:tcPr>
+            <w:tcW w:type="dxa" w:w="1728"/>
+          </w:tcPr>
+          <w:p>
+            <w:r>
+              <w:t>{{ item.detail }}</w:t>
+            </w:r>
+          </w:p>
+        </w:tc>
+      </w:tr>
+      <w:tr>
+        <w:tc>
+          <w:tcPr>
+            <w:tcW w:type="dxa" w:w="8640"/>
+            <w:gridSpan w:val="5"/>
+          </w:tcPr>
+          <w:p>
+            <w:r>
+              <w:t>{%tr endfor %}</w:t>
+            </w:r>
+          </w:p>
+        </w:tc>
+      </w:tr>
+    </w:tbl>
     <w:p/>
     <w:p/>
     <w:p>

</xml_diff>